<commit_message>
docs: publish verified CI results and lab report
</commit_message>
<xml_diff>
--- a/docs/report.docx
+++ b/docs/report.docx
@@ -2276,7 +2276,7 @@
           <w:sz w:val="28"/>
           <w:u w:val="none"/>
         </w:rPr>
-        <w:t>Для этого Python-проекта отключены RetireJS (JavaScript), OSS Index (отдельный сервис с учётными данными), автоматическая загрузка исключений и проверка новой версии сканера. NVD-анализ включён; собственные исключения уязвимостей не добавлены. Ошибка скачивания или сканирования не превращается в успешную проверку.</w:t>
+        <w:t>Для этого Python-проекта отключены RetireJS (JavaScript), OSS Index (отдельный сервис с учётными данными), автоматическая загрузка исключений и проверка новой версии сканера. NVD-анализ включён. В .github/dependency-check-suppressions.xml исключено одно подтверждённое ложное совпадение: CVE-2025-45770 для PyJWT 2.14.0. В записи NVD указан PHP-пакет lcobucci/jwt, а здесь используется Python-пакет PyJWT. Исключение ограничено конкретными пакетом, версией и CVE; остальные находки проверяются как обычно. Ошибка скачивания или сканирования не превращается в успешную проверку.</w:t>
       </w:r>
     </w:p>
     <w:p>
@@ -2325,7 +2325,109 @@
           <w:sz w:val="28"/>
           <w:u w:val="none"/>
         </w:rPr>
-        <w:t>Локальная проверка 30.09.2026: 51 тест пройден до обновления зависимости, 38 затронутых тестов повторно пройдены после обновления; Bandit без замечаний; Dependency-Check проверил 12 зависимостей без найденных уязвимостей; pip-audit также без найденных уязвимостей.</w:t>
+        <w:t>Проверенный запуск GitHub Actions от 30.09.2026: CI #7, коммит e312fb9 (https://github.com/virdxk/infosec-lab1/actions/runs/36704738027). Все три задачи завершились успешно:</w:t>
+      </w:r>
+    </w:p>
+    <w:p>
+      <w:pPr>
+        <w:spacing w:line="360" w:lineRule="auto" w:before="0" w:after="0"/>
+        <w:ind w:firstLine="709"/>
+        <w:jc w:val="both"/>
+      </w:pPr>
+      <w:r>
+        <w:rPr>
+          <w:rFonts w:ascii="Times New Roman" w:hAnsi="Times New Roman" w:cs="Times New Roman" w:eastAsia="Times New Roman"/>
+          <w:b w:val="0"/>
+          <w:i w:val="0"/>
+          <w:sz w:val="28"/>
+          <w:u w:val="none"/>
+        </w:rPr>
+        <w:t>- pytest: 51 тест пройден;</w:t>
+      </w:r>
+    </w:p>
+    <w:p>
+      <w:pPr>
+        <w:spacing w:line="360" w:lineRule="auto" w:before="0" w:after="0"/>
+        <w:ind w:firstLine="709"/>
+        <w:jc w:val="both"/>
+      </w:pPr>
+      <w:r>
+        <w:rPr>
+          <w:rFonts w:ascii="Times New Roman" w:hAnsi="Times New Roman" w:cs="Times New Roman" w:eastAsia="Times New Roman"/>
+          <w:b w:val="0"/>
+          <w:i w:val="0"/>
+          <w:sz w:val="28"/>
+          <w:u w:val="none"/>
+        </w:rPr>
+        <w:t>- Bandit: 0 замечаний;</w:t>
+      </w:r>
+    </w:p>
+    <w:p>
+      <w:pPr>
+        <w:spacing w:line="360" w:lineRule="auto" w:before="0" w:after="0"/>
+        <w:ind w:firstLine="709"/>
+        <w:jc w:val="both"/>
+      </w:pPr>
+      <w:r>
+        <w:rPr>
+          <w:rFonts w:ascii="Times New Roman" w:hAnsi="Times New Roman" w:cs="Times New Roman" w:eastAsia="Times New Roman"/>
+          <w:b w:val="0"/>
+          <w:i w:val="0"/>
+          <w:sz w:val="28"/>
+          <w:u w:val="none"/>
+        </w:rPr>
+        <w:t>- OWASP Dependency-Check: 13 зависимостей, 0 активных находок, одно обоснованное ложное совпадение исключено;</w:t>
+      </w:r>
+    </w:p>
+    <w:p>
+      <w:pPr>
+        <w:spacing w:line="360" w:lineRule="auto" w:before="0" w:after="0"/>
+        <w:ind w:firstLine="709"/>
+        <w:jc w:val="both"/>
+      </w:pPr>
+      <w:r>
+        <w:rPr>
+          <w:rFonts w:ascii="Times New Roman" w:hAnsi="Times New Roman" w:cs="Times New Roman" w:eastAsia="Times New Roman"/>
+          <w:b w:val="0"/>
+          <w:i w:val="0"/>
+          <w:sz w:val="28"/>
+          <w:u w:val="none"/>
+        </w:rPr>
+        <w:t>- pip-audit: 13 зависимостей, 0 известных уязвимостей.</w:t>
+      </w:r>
+    </w:p>
+    <w:p>
+      <w:pPr>
+        <w:spacing w:line="360" w:lineRule="auto" w:before="0" w:after="0"/>
+        <w:ind w:firstLine="709"/>
+        <w:jc w:val="both"/>
+      </w:pPr>
+      <w:r>
+        <w:rPr>
+          <w:rFonts w:ascii="Times New Roman" w:hAnsi="Times New Roman" w:cs="Times New Roman" w:eastAsia="Times New Roman"/>
+          <w:b w:val="0"/>
+          <w:i w:val="0"/>
+          <w:sz w:val="28"/>
+          <w:u w:val="none"/>
+        </w:rPr>
+        <w:t>Сканирование отражает состояние баз уязвимостей на момент запуска и не доказывает отсутствие всех возможных проблем.</w:t>
+      </w:r>
+    </w:p>
+    <w:p>
+      <w:pPr>
+        <w:spacing w:line="360" w:lineRule="auto" w:before="0" w:after="0"/>
+        <w:ind w:firstLine="709"/>
+        <w:jc w:val="both"/>
+      </w:pPr>
+      <w:r>
+        <w:rPr>
+          <w:rFonts w:ascii="Times New Roman" w:hAnsi="Times New Roman" w:cs="Times New Roman" w:eastAsia="Times New Roman"/>
+          <w:b w:val="0"/>
+          <w:i w:val="0"/>
+          <w:sz w:val="28"/>
+          <w:u w:val="none"/>
+        </w:rPr>
+        <w:t>Материалы проверки:</w:t>
       </w:r>
     </w:p>
     <w:p>
@@ -2359,7 +2461,7 @@
           <w:sz w:val="28"/>
           <w:u w:val="none"/>
         </w:rPr>
-        <w:t>- Локальный отчёт Bandit (docs/reports/bandit.json).</w:t>
+        <w:t>- Отчёт Bandit из CI (docs/reports/bandit.json).</w:t>
       </w:r>
     </w:p>
     <w:p>
@@ -2376,7 +2478,7 @@
           <w:sz w:val="28"/>
           <w:u w:val="none"/>
         </w:rPr>
-        <w:t>- Локальный отчёт pip-audit (docs/reports/pip-audit.json).</w:t>
+        <w:t>- Отчёт pip-audit из CI (docs/reports/pip-audit.json).</w:t>
       </w:r>
     </w:p>
     <w:p>
@@ -2393,7 +2495,7 @@
           <w:sz w:val="28"/>
           <w:u w:val="none"/>
         </w:rPr>
-        <w:t>- Отчёт OWASP Dependency-Check (docs/reports/dependency-check-report.html).</w:t>
+        <w:t>- Отчёт OWASP Dependency-Check из CI (docs/reports/dependency-check-report.html) и его JSON-версия (docs/reports/dependency-check-report.json).</w:t>
       </w:r>
     </w:p>
     <w:p>
@@ -2410,7 +2512,7 @@
           <w:sz w:val="28"/>
           <w:u w:val="none"/>
         </w:rPr>
-        <w:t>Новый запуск GitHub Actions для окончательного набора изменений ещё не подтверждён. Перед сдачей нужна ссылка на его успешный результат и скриншоты его SAST/SCA-задач. Существующие изображения ниже относятся к прежней версии pipeline с pip-audit и не подтверждают новый Dependency-Check.</w:t>
+        <w:t>- Запуски pipeline, завершившиеся успешно (https://github.com/virdxk/infosec-lab1/actions/workflows/ci.yml?query=is%3Asuccess): новые коммиты с материалами отчёта также запускают CI; скриншоты ниже относятся к проверке кода в e312fb9.</w:t>
       </w:r>
     </w:p>
     <w:p>
@@ -2422,7 +2524,7 @@
       <w:r>
         <w:drawing>
           <wp:inline xmlns:a="http://schemas.openxmlformats.org/drawingml/2006/main" xmlns:pic="http://schemas.openxmlformats.org/drawingml/2006/picture">
-            <wp:extent cx="5400000" cy="4718250"/>
+            <wp:extent cx="5400000" cy="3037500"/>
             <wp:docPr id="1" name="Picture 1"/>
             <wp:cNvGraphicFramePr>
               <a:graphicFrameLocks noChangeAspect="1"/>
@@ -2443,7 +2545,7 @@
                   <pic:spPr>
                     <a:xfrm>
                       <a:off x="0" y="0"/>
-                      <a:ext cx="5400000" cy="4718250"/>
+                      <a:ext cx="5400000" cy="3037500"/>
                     </a:xfrm>
                     <a:prstGeom prst="rect"/>
                   </pic:spPr>
@@ -2468,7 +2570,7 @@
           <w:sz w:val="28"/>
           <w:u w:val="none"/>
         </w:rPr>
-        <w:t>Рисунок 1 — Предыдущий запуск GitHub Actions</w:t>
+        <w:t>Рисунок 1 — Успешный запуск GitHub Actions</w:t>
       </w:r>
     </w:p>
     <w:p>
@@ -2480,7 +2582,7 @@
       <w:r>
         <w:drawing>
           <wp:inline xmlns:a="http://schemas.openxmlformats.org/drawingml/2006/main" xmlns:pic="http://schemas.openxmlformats.org/drawingml/2006/picture">
-            <wp:extent cx="5400000" cy="4280727"/>
+            <wp:extent cx="5400000" cy="3037500"/>
             <wp:docPr id="2" name="Picture 2"/>
             <wp:cNvGraphicFramePr>
               <a:graphicFrameLocks noChangeAspect="1"/>
@@ -2501,7 +2603,7 @@
                   <pic:spPr>
                     <a:xfrm>
                       <a:off x="0" y="0"/>
-                      <a:ext cx="5400000" cy="4280727"/>
+                      <a:ext cx="5400000" cy="3037500"/>
                     </a:xfrm>
                     <a:prstGeom prst="rect"/>
                   </pic:spPr>
@@ -2526,7 +2628,7 @@
           <w:sz w:val="28"/>
           <w:u w:val="none"/>
         </w:rPr>
-        <w:t>Рисунок 2 — Предыдущий отчёт SAST</w:t>
+        <w:t>Рисунок 2 — Успешная проверка SAST: Bandit</w:t>
       </w:r>
     </w:p>
     <w:p>
@@ -2538,7 +2640,7 @@
       <w:r>
         <w:drawing>
           <wp:inline xmlns:a="http://schemas.openxmlformats.org/drawingml/2006/main" xmlns:pic="http://schemas.openxmlformats.org/drawingml/2006/picture">
-            <wp:extent cx="5400000" cy="3927273"/>
+            <wp:extent cx="5400000" cy="3037500"/>
             <wp:docPr id="3" name="Picture 3"/>
             <wp:cNvGraphicFramePr>
               <a:graphicFrameLocks noChangeAspect="1"/>
@@ -2547,7 +2649,7 @@
               <a:graphicData uri="http://schemas.openxmlformats.org/drawingml/2006/picture">
                 <pic:pic>
                   <pic:nvPicPr>
-                    <pic:cNvPr id="0" name="03-ci-sca-pip-audit.png"/>
+                    <pic:cNvPr id="0" name="03-ci-sca-dependency-check.png"/>
                     <pic:cNvPicPr/>
                   </pic:nvPicPr>
                   <pic:blipFill>
@@ -2559,7 +2661,7 @@
                   <pic:spPr>
                     <a:xfrm>
                       <a:off x="0" y="0"/>
-                      <a:ext cx="5400000" cy="3927273"/>
+                      <a:ext cx="5400000" cy="3037500"/>
                     </a:xfrm>
                     <a:prstGeom prst="rect"/>
                   </pic:spPr>
@@ -2584,7 +2686,7 @@
           <w:sz w:val="28"/>
           <w:u w:val="none"/>
         </w:rPr>
-        <w:t>Рисунок 3 — Предыдущий отчёт SCA с pip-audit</w:t>
+        <w:t>Рисунок 3 — Успешная проверка SCA: Dependency-Check и pip-audit</w:t>
       </w:r>
     </w:p>
     <w:p>
@@ -3199,6 +3301,40 @@
       </w:r>
     </w:p>
     <w:p>
+      <w:pPr>
+        <w:spacing w:line="360" w:lineRule="auto" w:before="0" w:after="0"/>
+        <w:ind w:firstLine="709"/>
+        <w:jc w:val="both"/>
+      </w:pPr>
+      <w:r>
+        <w:rPr>
+          <w:rFonts w:ascii="Times New Roman" w:hAnsi="Times New Roman" w:cs="Times New Roman" w:eastAsia="Times New Roman"/>
+          <w:b w:val="0"/>
+          <w:i w:val="0"/>
+          <w:sz w:val="28"/>
+          <w:u w:val="none"/>
+        </w:rPr>
+        <w:t>- NVD: CVE-2025-45770 (https://nvd.nist.gov/vuln/detail/CVE-2025-45770) и документация PHP-библиотеки lcobucci/jwt (https://lcobucci-jwt.readthedocs.io/en/stable/): обоснование ложного совпадения.</w:t>
+      </w:r>
+    </w:p>
+    <w:p>
+      <w:pPr>
+        <w:spacing w:line="360" w:lineRule="auto" w:before="0" w:after="0"/>
+        <w:ind w:firstLine="709"/>
+        <w:jc w:val="both"/>
+      </w:pPr>
+      <w:r>
+        <w:rPr>
+          <w:rFonts w:ascii="Times New Roman" w:hAnsi="Times New Roman" w:cs="Times New Roman" w:eastAsia="Times New Roman"/>
+          <w:b w:val="0"/>
+          <w:i w:val="0"/>
+          <w:sz w:val="28"/>
+          <w:u w:val="none"/>
+        </w:rPr>
+        <w:t>- Dependency-Check: исключения ложных совпадений (https://dependency-check.github.io/DependencyCheck/general/suppression.html).</w:t>
+      </w:r>
+    </w:p>
+    <w:p>
       <w:r>
         <w:br w:type="page"/>
       </w:r>
@@ -3232,7 +3368,7 @@
           <w:sz w:val="28"/>
           <w:u w:val="none"/>
         </w:rPr>
-        <w:t>Выполнено: 2026-09-30T09:42:44.280976+00:00.</w:t>
+        <w:t>Выполнено: 2026-09-30T10:50:27.283550+00:00.</w:t>
       </w:r>
     </w:p>
     <w:p>
@@ -3266,7 +3402,7 @@
           <w:sz w:val="28"/>
           <w:u w:val="none"/>
         </w:rPr>
-        <w:t xml:space="preserve">Адрес при проверке: http://127.0.0.1:65021. В командах </w:t>
+        <w:t xml:space="preserve">Адрес при проверке: http://127.0.0.1:50747. В командах </w:t>
       </w:r>
       <m:oMath>
         <m:r>
@@ -3414,6 +3550,7 @@
     </w:p>
     <w:p>
       <w:pPr>
+        <w:keepNext/>
         <w:spacing w:line="240" w:lineRule="auto" w:before="0" w:after="0"/>
         <w:ind w:left="283" w:firstLine="0"/>
         <w:jc w:val="left"/>
@@ -3423,7 +3560,36 @@
           <w:rFonts w:ascii="Courier New" w:hAnsi="Courier New" w:cs="Courier New" w:eastAsia="Courier New"/>
           <w:sz w:val="22"/>
         </w:rPr>
-        <w:t>curl -sS -X POST "$BASE_URL/auth/login" -H "Content-Type: application/json" --data '{"username": "alice", "password": "Al1ce-Str0ng-Pass!"}'</w:t>
+        <w:t>curl -sS -X POST "$BASE_URL/auth/login" \</w:t>
+      </w:r>
+    </w:p>
+    <w:p>
+      <w:pPr>
+        <w:keepNext/>
+        <w:spacing w:line="240" w:lineRule="auto" w:before="0" w:after="0"/>
+        <w:ind w:left="283" w:firstLine="0"/>
+        <w:jc w:val="left"/>
+      </w:pPr>
+      <w:r>
+        <w:rPr>
+          <w:rFonts w:ascii="Courier New" w:hAnsi="Courier New" w:cs="Courier New" w:eastAsia="Courier New"/>
+          <w:sz w:val="22"/>
+        </w:rPr>
+        <w:t xml:space="preserve">  -H "Content-Type: application/json" \</w:t>
+      </w:r>
+    </w:p>
+    <w:p>
+      <w:pPr>
+        <w:spacing w:line="240" w:lineRule="auto" w:before="0" w:after="0"/>
+        <w:ind w:left="283" w:firstLine="0"/>
+        <w:jc w:val="left"/>
+      </w:pPr>
+      <w:r>
+        <w:rPr>
+          <w:rFonts w:ascii="Courier New" w:hAnsi="Courier New" w:cs="Courier New" w:eastAsia="Courier New"/>
+          <w:sz w:val="22"/>
+        </w:rPr>
+        <w:t xml:space="preserve">  --data '{"username": "alice", "password": "Al1ce-Str0ng-Pass!"}'</w:t>
       </w:r>
     </w:p>
     <w:p>
@@ -3534,6 +3700,7 @@
     </w:p>
     <w:p>
       <w:pPr>
+        <w:keepNext/>
         <w:spacing w:line="240" w:lineRule="auto" w:before="0" w:after="0"/>
         <w:ind w:left="283" w:firstLine="0"/>
         <w:jc w:val="left"/>
@@ -3543,7 +3710,36 @@
           <w:rFonts w:ascii="Courier New" w:hAnsi="Courier New" w:cs="Courier New" w:eastAsia="Courier New"/>
           <w:sz w:val="22"/>
         </w:rPr>
-        <w:t>curl -sS -X POST "$BASE_URL/auth/login" -H "Content-Type: application/json" --data '{"username": "alice", "password": "wrong"}'</w:t>
+        <w:t>curl -sS -X POST "$BASE_URL/auth/login" \</w:t>
+      </w:r>
+    </w:p>
+    <w:p>
+      <w:pPr>
+        <w:keepNext/>
+        <w:spacing w:line="240" w:lineRule="auto" w:before="0" w:after="0"/>
+        <w:ind w:left="283" w:firstLine="0"/>
+        <w:jc w:val="left"/>
+      </w:pPr>
+      <w:r>
+        <w:rPr>
+          <w:rFonts w:ascii="Courier New" w:hAnsi="Courier New" w:cs="Courier New" w:eastAsia="Courier New"/>
+          <w:sz w:val="22"/>
+        </w:rPr>
+        <w:t xml:space="preserve">  -H "Content-Type: application/json" \</w:t>
+      </w:r>
+    </w:p>
+    <w:p>
+      <w:pPr>
+        <w:spacing w:line="240" w:lineRule="auto" w:before="0" w:after="0"/>
+        <w:ind w:left="283" w:firstLine="0"/>
+        <w:jc w:val="left"/>
+      </w:pPr>
+      <w:r>
+        <w:rPr>
+          <w:rFonts w:ascii="Courier New" w:hAnsi="Courier New" w:cs="Courier New" w:eastAsia="Courier New"/>
+          <w:sz w:val="22"/>
+        </w:rPr>
+        <w:t xml:space="preserve">  --data '{"username": "alice", "password": "wrong"}'</w:t>
       </w:r>
     </w:p>
     <w:p>
@@ -3624,6 +3820,7 @@
     </w:p>
     <w:p>
       <w:pPr>
+        <w:keepNext/>
         <w:spacing w:line="240" w:lineRule="auto" w:before="0" w:after="0"/>
         <w:ind w:left="283" w:firstLine="0"/>
         <w:jc w:val="left"/>
@@ -3633,7 +3830,36 @@
           <w:rFonts w:ascii="Courier New" w:hAnsi="Courier New" w:cs="Courier New" w:eastAsia="Courier New"/>
           <w:sz w:val="22"/>
         </w:rPr>
-        <w:t>curl -sS -X POST "$BASE_URL/auth/login" -H "Content-Type: application/json" --data '{"username": "nobody", "password": "wrong"}'</w:t>
+        <w:t>curl -sS -X POST "$BASE_URL/auth/login" \</w:t>
+      </w:r>
+    </w:p>
+    <w:p>
+      <w:pPr>
+        <w:keepNext/>
+        <w:spacing w:line="240" w:lineRule="auto" w:before="0" w:after="0"/>
+        <w:ind w:left="283" w:firstLine="0"/>
+        <w:jc w:val="left"/>
+      </w:pPr>
+      <w:r>
+        <w:rPr>
+          <w:rFonts w:ascii="Courier New" w:hAnsi="Courier New" w:cs="Courier New" w:eastAsia="Courier New"/>
+          <w:sz w:val="22"/>
+        </w:rPr>
+        <w:t xml:space="preserve">  -H "Content-Type: application/json" \</w:t>
+      </w:r>
+    </w:p>
+    <w:p>
+      <w:pPr>
+        <w:spacing w:line="240" w:lineRule="auto" w:before="0" w:after="0"/>
+        <w:ind w:left="283" w:firstLine="0"/>
+        <w:jc w:val="left"/>
+      </w:pPr>
+      <w:r>
+        <w:rPr>
+          <w:rFonts w:ascii="Courier New" w:hAnsi="Courier New" w:cs="Courier New" w:eastAsia="Courier New"/>
+          <w:sz w:val="22"/>
+        </w:rPr>
+        <w:t xml:space="preserve">  --data '{"username": "nobody", "password": "wrong"}'</w:t>
       </w:r>
     </w:p>
     <w:p>
@@ -3714,6 +3940,7 @@
     </w:p>
     <w:p>
       <w:pPr>
+        <w:keepNext/>
         <w:spacing w:line="240" w:lineRule="auto" w:before="0" w:after="0"/>
         <w:ind w:left="283" w:firstLine="0"/>
         <w:jc w:val="left"/>
@@ -3723,7 +3950,51 @@
           <w:rFonts w:ascii="Courier New" w:hAnsi="Courier New" w:cs="Courier New" w:eastAsia="Courier New"/>
           <w:sz w:val="22"/>
         </w:rPr>
-        <w:t>curl -sS -X POST "$BASE_URL/auth/login" -H "Content-Type: application/json" --data '{"username": "\' OR \'1\'=\'1\' --", "password": "wrong"}'</w:t>
+        <w:t>curl -sS -X POST "$BASE_URL/auth/login" \</w:t>
+      </w:r>
+    </w:p>
+    <w:p>
+      <w:pPr>
+        <w:keepNext/>
+        <w:spacing w:line="240" w:lineRule="auto" w:before="0" w:after="0"/>
+        <w:ind w:left="283" w:firstLine="0"/>
+        <w:jc w:val="left"/>
+      </w:pPr>
+      <w:r>
+        <w:rPr>
+          <w:rFonts w:ascii="Courier New" w:hAnsi="Courier New" w:cs="Courier New" w:eastAsia="Courier New"/>
+          <w:sz w:val="22"/>
+        </w:rPr>
+        <w:t xml:space="preserve">  -H "Content-Type: application/json" --data @- &lt;&lt;'JSON'</w:t>
+      </w:r>
+    </w:p>
+    <w:p>
+      <w:pPr>
+        <w:keepNext/>
+        <w:spacing w:line="240" w:lineRule="auto" w:before="0" w:after="0"/>
+        <w:ind w:left="283" w:firstLine="0"/>
+        <w:jc w:val="left"/>
+      </w:pPr>
+      <w:r>
+        <w:rPr>
+          <w:rFonts w:ascii="Courier New" w:hAnsi="Courier New" w:cs="Courier New" w:eastAsia="Courier New"/>
+          <w:sz w:val="22"/>
+        </w:rPr>
+        <w:t>{"username": "' OR '1'='1' --", "password": "wrong"}</w:t>
+      </w:r>
+    </w:p>
+    <w:p>
+      <w:pPr>
+        <w:spacing w:line="240" w:lineRule="auto" w:before="0" w:after="0"/>
+        <w:ind w:left="283" w:firstLine="0"/>
+        <w:jc w:val="left"/>
+      </w:pPr>
+      <w:r>
+        <w:rPr>
+          <w:rFonts w:ascii="Courier New" w:hAnsi="Courier New" w:cs="Courier New" w:eastAsia="Courier New"/>
+          <w:sz w:val="22"/>
+        </w:rPr>
+        <w:t>JSON</w:t>
       </w:r>
     </w:p>
     <w:p>
@@ -3804,6 +4075,7 @@
     </w:p>
     <w:p>
       <w:pPr>
+        <w:keepNext/>
         <w:spacing w:line="240" w:lineRule="auto" w:before="0" w:after="0"/>
         <w:ind w:left="283" w:firstLine="0"/>
         <w:jc w:val="left"/>
@@ -3813,7 +4085,36 @@
           <w:rFonts w:ascii="Courier New" w:hAnsi="Courier New" w:cs="Courier New" w:eastAsia="Courier New"/>
           <w:sz w:val="22"/>
         </w:rPr>
-        <w:t>curl -sS -X POST "$BASE_URL/auth/login" -H "Content-Type: application/json" --data '{}'</w:t>
+        <w:t>curl -sS -X POST "$BASE_URL/auth/login" \</w:t>
+      </w:r>
+    </w:p>
+    <w:p>
+      <w:pPr>
+        <w:keepNext/>
+        <w:spacing w:line="240" w:lineRule="auto" w:before="0" w:after="0"/>
+        <w:ind w:left="283" w:firstLine="0"/>
+        <w:jc w:val="left"/>
+      </w:pPr>
+      <w:r>
+        <w:rPr>
+          <w:rFonts w:ascii="Courier New" w:hAnsi="Courier New" w:cs="Courier New" w:eastAsia="Courier New"/>
+          <w:sz w:val="22"/>
+        </w:rPr>
+        <w:t xml:space="preserve">  -H "Content-Type: application/json" \</w:t>
+      </w:r>
+    </w:p>
+    <w:p>
+      <w:pPr>
+        <w:spacing w:line="240" w:lineRule="auto" w:before="0" w:after="0"/>
+        <w:ind w:left="283" w:firstLine="0"/>
+        <w:jc w:val="left"/>
+      </w:pPr>
+      <w:r>
+        <w:rPr>
+          <w:rFonts w:ascii="Courier New" w:hAnsi="Courier New" w:cs="Courier New" w:eastAsia="Courier New"/>
+          <w:sz w:val="22"/>
+        </w:rPr>
+        <w:t xml:space="preserve">  --data '{}'</w:t>
       </w:r>
     </w:p>
     <w:p>
@@ -3984,6 +4285,7 @@
     </w:p>
     <w:p>
       <w:pPr>
+        <w:keepNext/>
         <w:spacing w:line="240" w:lineRule="auto" w:before="0" w:after="0"/>
         <w:ind w:left="283" w:firstLine="0"/>
         <w:jc w:val="left"/>
@@ -3993,7 +4295,21 @@
           <w:rFonts w:ascii="Courier New" w:hAnsi="Courier New" w:cs="Courier New" w:eastAsia="Courier New"/>
           <w:sz w:val="22"/>
         </w:rPr>
-        <w:t>curl -sS -X GET "$BASE_URL/api/data" -H "Authorization: Bearer $TOKEN"</w:t>
+        <w:t>curl -sS -X GET "$BASE_URL/api/data" \</w:t>
+      </w:r>
+    </w:p>
+    <w:p>
+      <w:pPr>
+        <w:spacing w:line="240" w:lineRule="auto" w:before="0" w:after="0"/>
+        <w:ind w:left="283" w:firstLine="0"/>
+        <w:jc w:val="left"/>
+      </w:pPr>
+      <w:r>
+        <w:rPr>
+          <w:rFonts w:ascii="Courier New" w:hAnsi="Courier New" w:cs="Courier New" w:eastAsia="Courier New"/>
+          <w:sz w:val="22"/>
+        </w:rPr>
+        <w:t xml:space="preserve">  -H "Authorization: Bearer invalid"</w:t>
       </w:r>
     </w:p>
     <w:p>
@@ -4074,6 +4390,7 @@
     </w:p>
     <w:p>
       <w:pPr>
+        <w:keepNext/>
         <w:spacing w:line="240" w:lineRule="auto" w:before="0" w:after="0"/>
         <w:ind w:left="283" w:firstLine="0"/>
         <w:jc w:val="left"/>
@@ -4083,7 +4400,21 @@
           <w:rFonts w:ascii="Courier New" w:hAnsi="Courier New" w:cs="Courier New" w:eastAsia="Courier New"/>
           <w:sz w:val="22"/>
         </w:rPr>
-        <w:t>curl -sS -X GET "$BASE_URL/api/data" -H "Authorization: Bearer $TOKEN"</w:t>
+        <w:t>curl -sS -X GET "$BASE_URL/api/data" \</w:t>
+      </w:r>
+    </w:p>
+    <w:p>
+      <w:pPr>
+        <w:spacing w:line="240" w:lineRule="auto" w:before="0" w:after="0"/>
+        <w:ind w:left="283" w:firstLine="0"/>
+        <w:jc w:val="left"/>
+      </w:pPr>
+      <w:r>
+        <w:rPr>
+          <w:rFonts w:ascii="Courier New" w:hAnsi="Courier New" w:cs="Courier New" w:eastAsia="Courier New"/>
+          <w:sz w:val="22"/>
+        </w:rPr>
+        <w:t xml:space="preserve">  -H "Authorization: Bearer $TOKEN"</w:t>
       </w:r>
     </w:p>
     <w:p>
@@ -4205,7 +4536,7 @@
           <w:rFonts w:ascii="Courier New" w:hAnsi="Courier New" w:cs="Courier New" w:eastAsia="Courier New"/>
           <w:sz w:val="22"/>
         </w:rPr>
-        <w:t xml:space="preserve">      "created_at": "2026-09-30T09:42:43.325484",</w:t>
+        <w:t xml:space="preserve">      "created_at": "2026-09-30T10:50:26.266392",</w:t>
       </w:r>
     </w:p>
     <w:p>
@@ -4310,7 +4641,7 @@
           <w:rFonts w:ascii="Courier New" w:hAnsi="Courier New" w:cs="Courier New" w:eastAsia="Courier New"/>
           <w:sz w:val="22"/>
         </w:rPr>
-        <w:t xml:space="preserve">      "created_at": "2026-09-30T09:42:43.325857",</w:t>
+        <w:t xml:space="preserve">      "created_at": "2026-09-30T10:50:26.266880",</w:t>
       </w:r>
     </w:p>
     <w:p>
@@ -4404,6 +4735,7 @@
     </w:p>
     <w:p>
       <w:pPr>
+        <w:keepNext/>
         <w:spacing w:line="240" w:lineRule="auto" w:before="0" w:after="0"/>
         <w:ind w:left="283" w:firstLine="0"/>
         <w:jc w:val="left"/>
@@ -4413,7 +4745,51 @@
           <w:rFonts w:ascii="Courier New" w:hAnsi="Courier New" w:cs="Courier New" w:eastAsia="Courier New"/>
           <w:sz w:val="22"/>
         </w:rPr>
-        <w:t>curl -sS -X POST "$BASE_URL/api/posts" -H "Content-Type: application/json" --data '{"title": "XSS probe", "body": "&lt;script&gt;alert(1)&lt;/script&gt;"}' -H "Authorization: Bearer $TOKEN"</w:t>
+        <w:t>curl -sS -X POST "$BASE_URL/api/posts" \</w:t>
+      </w:r>
+    </w:p>
+    <w:p>
+      <w:pPr>
+        <w:keepNext/>
+        <w:spacing w:line="240" w:lineRule="auto" w:before="0" w:after="0"/>
+        <w:ind w:left="283" w:firstLine="0"/>
+        <w:jc w:val="left"/>
+      </w:pPr>
+      <w:r>
+        <w:rPr>
+          <w:rFonts w:ascii="Courier New" w:hAnsi="Courier New" w:cs="Courier New" w:eastAsia="Courier New"/>
+          <w:sz w:val="22"/>
+        </w:rPr>
+        <w:t xml:space="preserve">  -H "Content-Type: application/json" \</w:t>
+      </w:r>
+    </w:p>
+    <w:p>
+      <w:pPr>
+        <w:keepNext/>
+        <w:spacing w:line="240" w:lineRule="auto" w:before="0" w:after="0"/>
+        <w:ind w:left="283" w:firstLine="0"/>
+        <w:jc w:val="left"/>
+      </w:pPr>
+      <w:r>
+        <w:rPr>
+          <w:rFonts w:ascii="Courier New" w:hAnsi="Courier New" w:cs="Courier New" w:eastAsia="Courier New"/>
+          <w:sz w:val="22"/>
+        </w:rPr>
+        <w:t xml:space="preserve">  --data '{"title": "XSS probe", "body": "&lt;script&gt;alert(1)&lt;/script&gt;"}' \</w:t>
+      </w:r>
+    </w:p>
+    <w:p>
+      <w:pPr>
+        <w:spacing w:line="240" w:lineRule="auto" w:before="0" w:after="0"/>
+        <w:ind w:left="283" w:firstLine="0"/>
+        <w:jc w:val="left"/>
+      </w:pPr>
+      <w:r>
+        <w:rPr>
+          <w:rFonts w:ascii="Courier New" w:hAnsi="Courier New" w:cs="Courier New" w:eastAsia="Courier New"/>
+          <w:sz w:val="22"/>
+        </w:rPr>
+        <w:t xml:space="preserve">  -H "Authorization: Bearer $TOKEN"</w:t>
       </w:r>
     </w:p>
     <w:p>
@@ -4490,7 +4866,7 @@
           <w:rFonts w:ascii="Courier New" w:hAnsi="Courier New" w:cs="Courier New" w:eastAsia="Courier New"/>
           <w:sz w:val="22"/>
         </w:rPr>
-        <w:t xml:space="preserve">  "created_at": "2026-09-30T09:42:43.758417+00:00",</w:t>
+        <w:t xml:space="preserve">  "created_at": "2026-09-30T10:50:26.745658+00:00",</w:t>
       </w:r>
     </w:p>
     <w:p>
@@ -4554,6 +4930,7 @@
     </w:p>
     <w:p>
       <w:pPr>
+        <w:keepNext/>
         <w:spacing w:line="240" w:lineRule="auto" w:before="0" w:after="0"/>
         <w:ind w:left="283" w:firstLine="0"/>
         <w:jc w:val="left"/>
@@ -4563,7 +4940,21 @@
           <w:rFonts w:ascii="Courier New" w:hAnsi="Courier New" w:cs="Courier New" w:eastAsia="Courier New"/>
           <w:sz w:val="22"/>
         </w:rPr>
-        <w:t>curl -sS -X GET "$BASE_URL/api/data" -H "Authorization: Bearer $TOKEN"</w:t>
+        <w:t>curl -sS -X GET "$BASE_URL/api/data" \</w:t>
+      </w:r>
+    </w:p>
+    <w:p>
+      <w:pPr>
+        <w:spacing w:line="240" w:lineRule="auto" w:before="0" w:after="0"/>
+        <w:ind w:left="283" w:firstLine="0"/>
+        <w:jc w:val="left"/>
+      </w:pPr>
+      <w:r>
+        <w:rPr>
+          <w:rFonts w:ascii="Courier New" w:hAnsi="Courier New" w:cs="Courier New" w:eastAsia="Courier New"/>
+          <w:sz w:val="22"/>
+        </w:rPr>
+        <w:t xml:space="preserve">  -H "Authorization: Bearer $TOKEN"</w:t>
       </w:r>
     </w:p>
     <w:p>
@@ -4685,7 +5076,7 @@
           <w:rFonts w:ascii="Courier New" w:hAnsi="Courier New" w:cs="Courier New" w:eastAsia="Courier New"/>
           <w:sz w:val="22"/>
         </w:rPr>
-        <w:t xml:space="preserve">      "created_at": "2026-09-30T09:42:43.325484",</w:t>
+        <w:t xml:space="preserve">      "created_at": "2026-09-30T10:50:26.266392",</w:t>
       </w:r>
     </w:p>
     <w:p>
@@ -4790,7 +5181,7 @@
           <w:rFonts w:ascii="Courier New" w:hAnsi="Courier New" w:cs="Courier New" w:eastAsia="Courier New"/>
           <w:sz w:val="22"/>
         </w:rPr>
-        <w:t xml:space="preserve">      "created_at": "2026-09-30T09:42:43.325857",</w:t>
+        <w:t xml:space="preserve">      "created_at": "2026-09-30T10:50:26.266880",</w:t>
       </w:r>
     </w:p>
     <w:p>
@@ -4895,7 +5286,7 @@
           <w:rFonts w:ascii="Courier New" w:hAnsi="Courier New" w:cs="Courier New" w:eastAsia="Courier New"/>
           <w:sz w:val="22"/>
         </w:rPr>
-        <w:t xml:space="preserve">      "created_at": "2026-09-30T09:42:43.758417",</w:t>
+        <w:t xml:space="preserve">      "created_at": "2026-09-30T10:50:26.745658",</w:t>
       </w:r>
     </w:p>
     <w:p>
@@ -4989,6 +5380,7 @@
     </w:p>
     <w:p>
       <w:pPr>
+        <w:keepNext/>
         <w:spacing w:line="240" w:lineRule="auto" w:before="0" w:after="0"/>
         <w:ind w:left="283" w:firstLine="0"/>
         <w:jc w:val="left"/>
@@ -4998,7 +5390,36 @@
           <w:rFonts w:ascii="Courier New" w:hAnsi="Courier New" w:cs="Courier New" w:eastAsia="Courier New"/>
           <w:sz w:val="22"/>
         </w:rPr>
-        <w:t>curl -sS -X POST "$BASE_URL/api/posts" -H "Content-Type: application/json" --data '{"title": "Denied", "body": "Denied"}'</w:t>
+        <w:t>curl -sS -X POST "$BASE_URL/api/posts" \</w:t>
+      </w:r>
+    </w:p>
+    <w:p>
+      <w:pPr>
+        <w:keepNext/>
+        <w:spacing w:line="240" w:lineRule="auto" w:before="0" w:after="0"/>
+        <w:ind w:left="283" w:firstLine="0"/>
+        <w:jc w:val="left"/>
+      </w:pPr>
+      <w:r>
+        <w:rPr>
+          <w:rFonts w:ascii="Courier New" w:hAnsi="Courier New" w:cs="Courier New" w:eastAsia="Courier New"/>
+          <w:sz w:val="22"/>
+        </w:rPr>
+        <w:t xml:space="preserve">  -H "Content-Type: application/json" \</w:t>
+      </w:r>
+    </w:p>
+    <w:p>
+      <w:pPr>
+        <w:spacing w:line="240" w:lineRule="auto" w:before="0" w:after="0"/>
+        <w:ind w:left="283" w:firstLine="0"/>
+        <w:jc w:val="left"/>
+      </w:pPr>
+      <w:r>
+        <w:rPr>
+          <w:rFonts w:ascii="Courier New" w:hAnsi="Courier New" w:cs="Courier New" w:eastAsia="Courier New"/>
+          <w:sz w:val="22"/>
+        </w:rPr>
+        <w:t xml:space="preserve">  --data '{"title": "Denied", "body": "Denied"}'</w:t>
       </w:r>
     </w:p>
     <w:p>
@@ -5113,7 +5534,7 @@
           <w:sz w:val="28"/>
           <w:u w:val="none"/>
         </w:rPr>
-        <w:t>Состояние удалённого CI указано в разделе результатов. Исторические скриншоты не заменяют подтверждение запуска для окончательной версии.</w:t>
+        <w:t>GitHub Actions успешно выполнил 51 тест, SAST и SCA. Подтверждённое ложное совпадение с PHP-библиотекой исключено адресно и объяснено в README. В отчёт включены ссылка на проверенный запуск, его скриншоты и фактические ответы curl.</w:t>
       </w:r>
     </w:p>
     <w:sectPr>

</xml_diff>